<commit_message>
Add Phase 4 analytics: SQL statistics, k-means segments, updated deliverables
- 07_analytics.sql: descriptive statistics (A1-A5), feature view
  v_student_features, BCNF segment tables, segment queries S1-S2,
  each with business question, FDS concepts and relational algebra
- analytics/: k-means notebook (built by build_notebook.py), HTML
  export, figures and results.json
- Rebuilds (run_all.ps1, app reset, test fixture) now include 07
- Schema tests count the 22 designed tables and 2 analytics tables
  separately; export_data.py keeps catalog figures on the designed schema
- Deck restructured to 20 slides with four analytics slides; report
  gains chapter 10; guide, testing report and runbook follow the new split

Co-Authored-By: Claude Opus 5.5 <noreply@anthropic.com>
</commit_message>
<xml_diff>
--- a/deliverables/PlaceIQ_Demo_Runbook.docx
+++ b/deliverables/PlaceIQ_Demo_Runbook.docx
@@ -364,7 +364,7 @@
                 <w:sz w:val="19"/>
                 <w:szCs w:val="19"/>
               </w:rPr>
-              <w:t xml:space="preserve">Schema &amp; normalization</w:t>
+              <w:t xml:space="preserve">Schema, normalization &amp; DDL</w:t>
             </w:r>
           </w:p>
         </w:tc>
@@ -453,7 +453,7 @@
                 <w:sz w:val="19"/>
                 <w:szCs w:val="19"/>
               </w:rPr>
-              <w:t xml:space="preserve">DDL, data &amp; queries</w:t>
+              <w:t xml:space="preserve">SQL queries &amp; rules</w:t>
             </w:r>
           </w:p>
         </w:tc>
@@ -542,7 +542,7 @@
                 <w:sz w:val="19"/>
                 <w:szCs w:val="19"/>
               </w:rPr>
-              <w:t xml:space="preserve">Rules, transactions &amp; performance</w:t>
+              <w:t xml:space="preserve">Analytics &amp; performance</w:t>
             </w:r>
           </w:p>
         </w:tc>
@@ -762,7 +762,7 @@
                 <w:sz w:val="19"/>
                 <w:szCs w:val="19"/>
               </w:rPr>
-              <w:t xml:space="preserve">M4 · [Member 4] (driving); M3 can operate the laptop</w:t>
+              <w:t xml:space="preserve">M3 · [Member 3] (driving); M4 can operate the laptop</w:t>
             </w:r>
           </w:p>
         </w:tc>
@@ -823,7 +823,7 @@
                 <w:sz w:val="19"/>
                 <w:szCs w:val="19"/>
               </w:rPr>
-              <w:t xml:space="preserve">Slide 14, at about 12:00 into the talk</w:t>
+              <w:t xml:space="preserve">Slide 14, at about 9:35 into the talk</w:t>
             </w:r>
           </w:p>
         </w:tc>
@@ -884,7 +884,7 @@
                 <w:sz w:val="19"/>
                 <w:szCs w:val="19"/>
               </w:rPr>
-              <w:t xml:space="preserve">75 seconds for the core demo (steps 4–6); the rest is optional for Q&amp;A</w:t>
+              <w:t xml:space="preserve">55 seconds for the core demo (steps 4–6); the rest is optional for Q&amp;A</w:t>
             </w:r>
           </w:p>
         </w:tc>

</xml_diff>